<commit_message>
Initial working demo version
</commit_message>
<xml_diff>
--- a/samples/contrato_fornecedor_A_logistica.docx
+++ b/samples/contrato_fornecedor_A_logistica.docx
@@ -42,6 +42,13 @@
         <w:br/>
         <w:t>Contratada: Fornecedor A.</w:t>
       </w:r>
+    </w:p>
+    <w:p>
+      <w:pPr>
+        <w:rPr>
+          <w:lang w:val="pt-BR"/>
+        </w:rPr>
+      </w:pPr>
     </w:p>
     <w:p>
       <w:pPr>
@@ -107,21 +114,167 @@
     <w:p>
       <w:pPr>
         <w:rPr>
+          <w:b/>
+          <w:bCs/>
+          <w:lang w:val="pt-BR"/>
+        </w:rPr>
+      </w:pPr>
+    </w:p>
+    <w:p>
+      <w:pPr>
+        <w:rPr>
+          <w:b/>
+          <w:bCs/>
           <w:lang w:val="pt-BR"/>
         </w:rPr>
       </w:pPr>
       <w:r>
         <w:rPr>
+          <w:b/>
+          <w:bCs/>
           <w:lang w:val="pt-BR"/>
         </w:rPr>
         <w:t>VALOR ESTIMADO</w:t>
       </w:r>
       <w:r>
         <w:rPr>
+          <w:b/>
+          <w:bCs/>
           <w:lang w:val="pt-BR"/>
         </w:rPr>
         <w:br/>
         <w:t>R$ 5.400.000,00 por ano.</w:t>
+      </w:r>
+    </w:p>
+    <w:p>
+      <w:pPr>
+        <w:rPr>
+          <w:lang w:val="pt-BR"/>
+        </w:rPr>
+      </w:pPr>
+    </w:p>
+    <w:p>
+      <w:pPr>
+        <w:rPr>
+          <w:b/>
+          <w:bCs/>
+          <w:lang w:val="pt-BR"/>
+        </w:rPr>
+      </w:pPr>
+      <w:r>
+        <w:rPr>
+          <w:b/>
+          <w:bCs/>
+          <w:lang w:val="pt-BR"/>
+        </w:rPr>
+        <w:t>PRAZO DE VIGENCIA</w:t>
+      </w:r>
+      <w:r>
+        <w:rPr>
+          <w:b/>
+          <w:bCs/>
+          <w:lang w:val="pt-BR"/>
+        </w:rPr>
+        <w:br/>
+        <w:t xml:space="preserve">12 meses, com </w:t>
+      </w:r>
+      <w:r>
+        <w:rPr>
+          <w:b/>
+          <w:bCs/>
+          <w:lang w:val="pt-BR"/>
+        </w:rPr>
+        <w:t>início</w:t>
+      </w:r>
+      <w:r>
+        <w:rPr>
+          <w:b/>
+          <w:bCs/>
+          <w:lang w:val="pt-BR"/>
+        </w:rPr>
+        <w:t xml:space="preserve"> em 1</w:t>
+      </w:r>
+      <w:r>
+        <w:rPr>
+          <w:b/>
+          <w:bCs/>
+          <w:lang w:val="pt-BR"/>
+        </w:rPr>
+        <w:t>9</w:t>
+      </w:r>
+      <w:r>
+        <w:rPr>
+          <w:b/>
+          <w:bCs/>
+          <w:lang w:val="pt-BR"/>
+        </w:rPr>
+        <w:t>/0</w:t>
+      </w:r>
+      <w:r>
+        <w:rPr>
+          <w:b/>
+          <w:bCs/>
+          <w:lang w:val="pt-BR"/>
+        </w:rPr>
+        <w:t>5</w:t>
+      </w:r>
+      <w:r>
+        <w:rPr>
+          <w:b/>
+          <w:bCs/>
+          <w:lang w:val="pt-BR"/>
+        </w:rPr>
+        <w:t xml:space="preserve">/2025 e </w:t>
+      </w:r>
+      <w:proofErr w:type="gramStart"/>
+      <w:r>
+        <w:rPr>
+          <w:b/>
+          <w:bCs/>
+          <w:lang w:val="pt-BR"/>
+        </w:rPr>
+        <w:t>termino</w:t>
+      </w:r>
+      <w:proofErr w:type="gramEnd"/>
+      <w:r>
+        <w:rPr>
+          <w:b/>
+          <w:bCs/>
+          <w:lang w:val="pt-BR"/>
+        </w:rPr>
+        <w:t xml:space="preserve"> em </w:t>
+      </w:r>
+      <w:r>
+        <w:rPr>
+          <w:b/>
+          <w:bCs/>
+          <w:lang w:val="pt-BR"/>
+        </w:rPr>
+        <w:t>20</w:t>
+      </w:r>
+      <w:r>
+        <w:rPr>
+          <w:b/>
+          <w:bCs/>
+          <w:lang w:val="pt-BR"/>
+        </w:rPr>
+        <w:t>/0</w:t>
+      </w:r>
+      <w:r>
+        <w:rPr>
+          <w:b/>
+          <w:bCs/>
+          <w:lang w:val="pt-BR"/>
+        </w:rPr>
+        <w:t>5</w:t>
+      </w:r>
+      <w:r>
+        <w:rPr>
+          <w:b/>
+          <w:bCs/>
+          <w:lang w:val="pt-BR"/>
+        </w:rPr>
+        <w:t>/2026.</w:t>
       </w:r>
     </w:p>
     <w:p>
@@ -139,65 +292,24 @@
       </w:pPr>
       <w:r>
         <w:rPr>
-          <w:lang w:val="pt-BR"/>
-        </w:rPr>
-        <w:t>PRAZO DE VIGENCIA</w:t>
-      </w:r>
-      <w:r>
-        <w:rPr>
-          <w:lang w:val="pt-BR"/>
-        </w:rPr>
-        <w:br/>
-        <w:t xml:space="preserve">12 meses, com </w:t>
-      </w:r>
-      <w:proofErr w:type="spellStart"/>
-      <w:proofErr w:type="gramStart"/>
-      <w:r>
-        <w:rPr>
-          <w:lang w:val="pt-BR"/>
-        </w:rPr>
-        <w:t>inicio</w:t>
-      </w:r>
-      <w:proofErr w:type="spellEnd"/>
-      <w:proofErr w:type="gramEnd"/>
-      <w:r>
-        <w:rPr>
-          <w:lang w:val="pt-BR"/>
-        </w:rPr>
-        <w:t xml:space="preserve"> em 01/05/2025 e </w:t>
-      </w:r>
-      <w:proofErr w:type="gramStart"/>
-      <w:r>
-        <w:rPr>
-          <w:lang w:val="pt-BR"/>
-        </w:rPr>
-        <w:t>termino</w:t>
-      </w:r>
-      <w:proofErr w:type="gramEnd"/>
-      <w:r>
-        <w:rPr>
-          <w:lang w:val="pt-BR"/>
-        </w:rPr>
-        <w:t xml:space="preserve"> em 30/04/2026.</w:t>
-      </w:r>
-    </w:p>
-    <w:p>
-      <w:pPr>
-        <w:rPr>
-          <w:lang w:val="pt-BR"/>
-        </w:rPr>
-      </w:pPr>
-      <w:r>
-        <w:rPr>
+          <w:b/>
+          <w:bCs/>
           <w:lang w:val="pt-BR"/>
         </w:rPr>
         <w:t>CLAUSULAS RELEVANTES</w:t>
       </w:r>
       <w:r>
         <w:rPr>
+          <w:b/>
+          <w:bCs/>
           <w:lang w:val="pt-BR"/>
         </w:rPr>
         <w:br/>
+      </w:r>
+      <w:r>
+        <w:rPr>
+          <w:lang w:val="pt-BR"/>
+        </w:rPr>
         <w:t xml:space="preserve">1. </w:t>
       </w:r>
       <w:proofErr w:type="spellStart"/>
@@ -284,13 +396,6 @@
         </w:rPr>
         <w:t xml:space="preserve"> de 30 dias.</w:t>
       </w:r>
-    </w:p>
-    <w:p>
-      <w:pPr>
-        <w:rPr>
-          <w:lang w:val="pt-BR"/>
-        </w:rPr>
-      </w:pPr>
       <w:r>
         <w:rPr>
           <w:lang w:val="pt-BR"/>
@@ -396,22 +501,53 @@
           <w:lang w:val="pt-BR"/>
         </w:rPr>
       </w:pPr>
+    </w:p>
+    <w:p>
+      <w:pPr>
+        <w:rPr>
+          <w:b/>
+          <w:bCs/>
+          <w:lang w:val="pt-BR"/>
+        </w:rPr>
+      </w:pPr>
       <w:r>
         <w:rPr>
+          <w:b/>
+          <w:bCs/>
           <w:lang w:val="pt-BR"/>
         </w:rPr>
         <w:t>OBSERVACOES PARA TESTE</w:t>
       </w:r>
       <w:r>
         <w:rPr>
+          <w:b/>
+          <w:bCs/>
           <w:lang w:val="pt-BR"/>
         </w:rPr>
         <w:br/>
-        <w:t xml:space="preserve">Contrato com alto potencial de risco por </w:t>
+        <w:t xml:space="preserve">Contrato com </w:t>
+      </w:r>
+      <w:r>
+        <w:rPr>
+          <w:b/>
+          <w:bCs/>
+          <w:lang w:val="pt-BR"/>
+        </w:rPr>
+        <w:t>A</w:t>
+      </w:r>
+      <w:r>
+        <w:rPr>
+          <w:b/>
+          <w:bCs/>
+          <w:lang w:val="pt-BR"/>
+        </w:rPr>
+        <w:t xml:space="preserve">lto potencial de risco por </w:t>
       </w:r>
       <w:proofErr w:type="spellStart"/>
       <w:r>
         <w:rPr>
+          <w:b/>
+          <w:bCs/>
           <w:lang w:val="pt-BR"/>
         </w:rPr>
         <w:t>renovacao</w:t>
@@ -419,6 +555,8 @@
       <w:proofErr w:type="spellEnd"/>
       <w:r>
         <w:rPr>
+          <w:b/>
+          <w:bCs/>
           <w:lang w:val="pt-BR"/>
         </w:rPr>
         <w:t xml:space="preserve"> </w:t>
@@ -426,6 +564,8 @@
       <w:proofErr w:type="spellStart"/>
       <w:r>
         <w:rPr>
+          <w:b/>
+          <w:bCs/>
           <w:lang w:val="pt-BR"/>
         </w:rPr>
         <w:t>automatica</w:t>
@@ -433,6 +573,8 @@
       <w:proofErr w:type="spellEnd"/>
       <w:r>
         <w:rPr>
+          <w:b/>
+          <w:bCs/>
           <w:lang w:val="pt-BR"/>
         </w:rPr>
         <w:t xml:space="preserve">, reajuste </w:t>
@@ -440,6 +582,8 @@
       <w:proofErr w:type="spellStart"/>
       <w:r>
         <w:rPr>
+          <w:b/>
+          <w:bCs/>
           <w:lang w:val="pt-BR"/>
         </w:rPr>
         <w:t>sensivel</w:t>
@@ -447,6 +591,8 @@
       <w:proofErr w:type="spellEnd"/>
       <w:r>
         <w:rPr>
+          <w:b/>
+          <w:bCs/>
           <w:lang w:val="pt-BR"/>
         </w:rPr>
         <w:t xml:space="preserve"> e multa </w:t>
@@ -454,6 +600,8 @@
       <w:proofErr w:type="spellStart"/>
       <w:r>
         <w:rPr>
+          <w:b/>
+          <w:bCs/>
           <w:lang w:val="pt-BR"/>
         </w:rPr>
         <w:t>rescisoria</w:t>
@@ -461,6 +609,8 @@
       <w:proofErr w:type="spellEnd"/>
       <w:r>
         <w:rPr>
+          <w:b/>
+          <w:bCs/>
           <w:lang w:val="pt-BR"/>
         </w:rPr>
         <w:t>.</w:t>

</xml_diff>